<commit_message>
Add rollover and earmarked funds rule to policy documents, methodology, README and report
Co-Authored-By: Claude Opus 5.5 <noreply@anthropic.com>
</commit_message>
<xml_diff>
--- a/policy/Fall 2026 Allocation Policy and Methodology.docx
+++ b/policy/Fall 2026 Allocation Policy and Methodology.docx
@@ -1804,28 +1804,7 @@
           <w:szCs w:val="21"/>
           <w:rtl w:val="0"/>
         </w:rPr>
-        <w:t>Rollover and external funds are treated as the presumed funder of everything HSG does not cover: excluded amounts and the unfunded remainder of any request are backstopped by the club's own balances pro rata, and how a club deploys its rollover across its events is entirely the club's decision. The committee records each club's total balance for reviewer context (including an informational column on the Events sheet) but never assigns rollover to specific events and never reduces an allocation by netting a balance against it; balances influence funding only through the Stewardship score in §7.2. For Fall 2026, each HSO’s balance is taken from its HarrisHub “Available” balance on October 13, 2026, so every club is measured the same way and from the same source.</w:t>
-      </w:r>
-      <w:r>
-        <w:rPr>
-          <w:rtl w:val="0"/>
-        </w:rPr>
-      </w:r>
-    </w:p>
-    <w:p>
-      <w:pPr>
-        <w:pStyle w:val="Heading1"/>
-        <w:spacing w:after="120" w:before="280" w:lineRule="auto"/>
-        <w:rPr/>
-      </w:pPr>
-      <w:r>
-        <w:rPr>
-          <w:b w:val="1"/>
-          <w:bCs w:val="1"/>
-          <w:color w:val="800000"/>
-          <w:rtl w:val="0"/>
-        </w:rPr>
-        <w:t xml:space="preserve">7. Scoring and allocation</w:t>
+        <w:t>Rollover and external funds are treated as the presumed funder of everything HSG does not cover: excluded amounts and the unfunded remainder of any request are backstopped by the club's own balances pro rata, and how a club deploys its rollover across its events is entirely the club's decision. The committee records each club's total balance for reviewer context (including an informational column on the Events sheet) but never assigns rollover to specific events and never reduces an allocation by netting a balance against it; balances influence funding only through the Stewardship score in §7.2. For Fall 2026, each HSO’s balance is taken from its HarrisHub “Available” balance on October 13, 2026, less any earmarked funds approved under §6.1, so every club is measured the same way and from the same source.</w:t>
       </w:r>
       <w:r>
         <w:rPr>
@@ -1841,17 +1820,10 @@
       </w:pPr>
       <w:r>
         <w:rPr>
-          <w:b w:val="1"/>
-          <w:bCs w:val="1"/>
           <w:color w:val="800000"/>
           <w:rtl w:val="0"/>
         </w:rPr>
-        <w:t xml:space="preserve">7.1 Scoring</w:t>
-      </w:r>
-      <w:r>
-        <w:rPr>
-          <w:rtl w:val="0"/>
-        </w:rPr>
+        <w:t xml:space="preserve">6.1 Rollover and earmarked funds</w:t>
       </w:r>
     </w:p>
     <w:p>
@@ -1866,90 +1838,7 @@
           <w:szCs w:val="21"/>
           <w:rtl w:val="0"/>
         </w:rPr>
-        <w:t xml:space="preserve">Each committee reviewer assigns each applicant club one integer score from 1 to 5 in each of three bins, Financial Stewardship (weight 0.30), Collaboration &amp; Inclusion (0.25), and Impact (0.45), against the written rubric anchors published on the Main tab of the workbook. A reviewer must score all three bins for a club or none; a blank row is a recusal and is excluded from that club's average. Reviewers recuse from clubs they belong to or have submitted for. Stewardshi</w:t>
-      </w:r>
-      <w:r>
-        <w:rPr>
-          <w:rtl w:val="0"/>
-        </w:rPr>
-        <w:t xml:space="preserve">p, and Collaboration are automatically calculated for each reviewer for each club, and overrides are at their discretion. </w:t>
-      </w:r>
-    </w:p>
-    <w:p>
-      <w:pPr>
-        <w:spacing w:after="120" w:lineRule="auto"/>
-        <w:jc w:val="both"/>
-        <w:rPr>
-          <w:b w:val="1"/>
-          <w:bCs w:val="1"/>
-        </w:rPr>
-      </w:pPr>
-      <w:r>
-        <w:rPr>
-          <w:sz w:val="21"/>
-          <w:szCs w:val="21"/>
-          <w:rtl w:val="0"/>
-        </w:rPr>
-        <w:t xml:space="preserve">Each reviewer will score Impact as follows: Impact should be defined by its relevance to the student body, innovation, and policy → subjective. </w:t>
-      </w:r>
-      <w:r>
-        <w:rPr>
-          <w:b w:val="1"/>
-          <w:bCs w:val="1"/>
-          <w:sz w:val="21"/>
-          <w:szCs w:val="21"/>
-          <w:rtl w:val="0"/>
-        </w:rPr>
-        <w:t xml:space="preserve">ANY </w:t>
-      </w:r>
-      <w:r>
-        <w:rPr>
-          <w:b w:val="1"/>
-          <w:bCs w:val="1"/>
-          <w:rtl w:val="0"/>
-        </w:rPr>
-        <w:t xml:space="preserve">AUTOMATED SCORE MAY BE OVERWRITTEN.</w:t>
-      </w:r>
-    </w:p>
-    <w:p>
-      <w:pPr>
-        <w:pStyle w:val="Heading2"/>
-        <w:spacing w:after="80" w:before="200" w:lineRule="auto"/>
-        <w:rPr/>
-      </w:pPr>
-      <w:r>
-        <w:rPr>
-          <w:b w:val="1"/>
-          <w:bCs w:val="1"/>
-          <w:color w:val="800000"/>
-          <w:rtl w:val="0"/>
-        </w:rPr>
-        <w:t xml:space="preserve">7.2 Objective scorer</w:t>
-      </w:r>
-      <w:r>
-        <w:rPr>
-          <w:rtl w:val="0"/>
-        </w:rPr>
-      </w:r>
-    </w:p>
-    <w:p>
-      <w:pPr>
-        <w:spacing w:after="120" w:lineRule="auto"/>
-        <w:jc w:val="both"/>
-        <w:rPr/>
-      </w:pPr>
-      <w:r>
-        <w:rPr>
-          <w:sz w:val="21"/>
-          <w:szCs w:val="21"/>
-          <w:rtl w:val="0"/>
-        </w:rPr>
-        <w:t xml:space="preserve">Alongside the human reviewers, an automatic scorer computes objective bin scores per club from application data and participates in the committee average with the standing of one reviewer:</w:t>
-      </w:r>
-      <w:r>
-        <w:rPr>
-          <w:rtl w:val="0"/>
-        </w:rPr>
+        <w:t xml:space="preserve">The committee treats an HSO’s full HarrisHub “Available” balance as rollover that can go toward its events. An HSO can ask to have part of that balance set aside only if the money is restricted by someone outside the HSO:</w:t>
       </w:r>
     </w:p>
     <w:p>
@@ -1969,8 +1858,285 @@
       </w:pPr>
       <w:r>
         <w:rPr>
+          <w:sz w:val="21"/>
+          <w:szCs w:val="21"/>
+          <w:rtl w:val="0"/>
+          <w:b/>
+        </w:rPr>
+        <w:t xml:space="preserve">External restriction: </w:t>
+      </w:r>
+      <w:r>
+        <w:rPr>
+          <w:sz w:val="21"/>
+          <w:szCs w:val="21"/>
+          <w:rtl w:val="0"/>
+        </w:rPr>
+        <w:t xml:space="preserve">a sponsor, donor or grant gave the money for a specific purpose or event.</w:t>
+      </w:r>
+    </w:p>
+    <w:p>
+      <w:pPr>
+        <w:numPr>
+          <w:ilvl w:val="0"/>
+          <w:numId w:val="1"/>
+        </w:numPr>
+        <w:spacing w:after="0" w:afterAutospacing="0" w:lineRule="auto"/>
+        <w:ind w:left="720" w:hanging="360"/>
+        <w:jc w:val="both"/>
+        <w:rPr>
+          <w:sz w:val="21"/>
+          <w:szCs w:val="21"/>
+          <w:u w:val="none"/>
+        </w:rPr>
+      </w:pPr>
+      <w:r>
+        <w:rPr>
+          <w:sz w:val="21"/>
+          <w:szCs w:val="21"/>
+          <w:rtl w:val="0"/>
+          <w:b/>
+        </w:rPr>
+        <w:t xml:space="preserve">Prior commitment: </w:t>
+      </w:r>
+      <w:r>
+        <w:rPr>
+          <w:sz w:val="21"/>
+          <w:szCs w:val="21"/>
+          <w:rtl w:val="0"/>
+        </w:rPr>
+        <w:t xml:space="preserve">a signed contract, deposit or invoice for a specific expense that isn’t yet a pending expense in HarrisHub.</w:t>
+      </w:r>
+    </w:p>
+    <w:p>
+      <w:pPr>
+        <w:spacing w:after="120" w:lineRule="auto" w:before="120"/>
+        <w:jc w:val="both"/>
+        <w:rPr/>
+      </w:pPr>
+      <w:r>
+        <w:rPr>
+          <w:sz w:val="21"/>
+          <w:szCs w:val="21"/>
+          <w:rtl w:val="0"/>
+        </w:rPr>
+        <w:t xml:space="preserve">To claim it, list each earmarked amount in the application with its </w:t>
+      </w:r>
+      <w:r>
+        <w:rPr>
+          <w:sz w:val="21"/>
+          <w:szCs w:val="21"/>
+          <w:rtl w:val="0"/>
+          <w:b/>
+        </w:rPr>
+        <w:t xml:space="preserve">source, the purpose it’s restricted to, and documentation</w:t>
+      </w:r>
+      <w:r>
+        <w:rPr>
+          <w:sz w:val="21"/>
+          <w:szCs w:val="21"/>
+          <w:rtl w:val="0"/>
+        </w:rPr>
+        <w:t xml:space="preserve"> (a sponsor email, agreement or invoice). Approved amounts are left out of rollover when Financial Stewardship is scored.</w:t>
+      </w:r>
+    </w:p>
+    <w:p>
+      <w:pPr>
+        <w:spacing w:after="120" w:lineRule="auto"/>
+        <w:jc w:val="both"/>
+        <w:rPr/>
+      </w:pPr>
+      <w:r>
+        <w:rPr>
+          <w:sz w:val="21"/>
+          <w:szCs w:val="21"/>
+          <w:rtl w:val="0"/>
+          <w:b/>
+        </w:rPr>
+        <w:t xml:space="preserve">What doesn’t count: </w:t>
+      </w:r>
+      <w:r>
+        <w:rPr>
+          <w:sz w:val="21"/>
+          <w:szCs w:val="21"/>
+          <w:rtl w:val="0"/>
+        </w:rPr>
+        <w:t xml:space="preserve">money the HSO plans to save for its own purposes, such as an end-of-year event or a future quarter. Pending expenses already shown in HarrisHub don’t count either, because the “Available” balance already subtracts them.</w:t>
+      </w:r>
+    </w:p>
+    <w:p>
+      <w:pPr>
+        <w:spacing w:after="120" w:lineRule="auto"/>
+        <w:jc w:val="both"/>
+        <w:rPr/>
+      </w:pPr>
+      <w:r>
+        <w:rPr>
+          <w:sz w:val="21"/>
+          <w:szCs w:val="21"/>
+          <w:rtl w:val="0"/>
+        </w:rPr>
+        <w:t xml:space="preserve">Earmarked money must be spent on its stated purpose. Any of it still unspent at the next allocation counts as regular rollover.</w:t>
+      </w:r>
+    </w:p>
+    <w:p>
+      <w:pPr>
+        <w:pStyle w:val="Heading1"/>
+        <w:spacing w:after="120" w:before="280" w:lineRule="auto"/>
+        <w:rPr/>
+      </w:pPr>
+      <w:r>
+        <w:rPr>
           <w:b w:val="1"/>
           <w:bCs w:val="1"/>
+          <w:color w:val="800000"/>
+          <w:rtl w:val="0"/>
+        </w:rPr>
+        <w:t xml:space="preserve">7. Scoring and allocation</w:t>
+      </w:r>
+      <w:r>
+        <w:rPr>
+          <w:rtl w:val="0"/>
+        </w:rPr>
+      </w:r>
+    </w:p>
+    <w:p>
+      <w:pPr>
+        <w:pStyle w:val="Heading2"/>
+        <w:spacing w:after="80" w:before="200" w:lineRule="auto"/>
+        <w:rPr/>
+      </w:pPr>
+      <w:r>
+        <w:rPr>
+          <w:b w:val="1"/>
+          <w:bCs w:val="1"/>
+          <w:color w:val="800000"/>
+          <w:rtl w:val="0"/>
+        </w:rPr>
+        <w:t xml:space="preserve">7.1 Scoring</w:t>
+      </w:r>
+      <w:r>
+        <w:rPr>
+          <w:rtl w:val="0"/>
+        </w:rPr>
+      </w:r>
+    </w:p>
+    <w:p>
+      <w:pPr>
+        <w:spacing w:after="120" w:lineRule="auto"/>
+        <w:jc w:val="both"/>
+        <w:rPr/>
+      </w:pPr>
+      <w:r>
+        <w:rPr>
+          <w:sz w:val="21"/>
+          <w:szCs w:val="21"/>
+          <w:rtl w:val="0"/>
+        </w:rPr>
+        <w:t xml:space="preserve">Each committee reviewer assigns each applicant club one integer score from 1 to 5 in each of three bins, Financial Stewardship (weight 0.30), Collaboration &amp; Inclusion (0.25), and Impact (0.45), against the written rubric anchors published on the Main tab of the workbook. A reviewer must score all three bins for a club or none; a blank row is a recusal and is excluded from that club's average. Reviewers recuse from clubs they belong to or have submitted for. Stewardshi</w:t>
+      </w:r>
+      <w:r>
+        <w:rPr>
+          <w:rtl w:val="0"/>
+        </w:rPr>
+        <w:t xml:space="preserve">p, and Collaboration are automatically calculated for each reviewer for each club, and overrides are at their discretion. </w:t>
+      </w:r>
+    </w:p>
+    <w:p>
+      <w:pPr>
+        <w:spacing w:after="120" w:lineRule="auto"/>
+        <w:jc w:val="both"/>
+        <w:rPr>
+          <w:b w:val="1"/>
+          <w:bCs w:val="1"/>
+        </w:rPr>
+      </w:pPr>
+      <w:r>
+        <w:rPr>
+          <w:sz w:val="21"/>
+          <w:szCs w:val="21"/>
+          <w:rtl w:val="0"/>
+        </w:rPr>
+        <w:t xml:space="preserve">Each reviewer will score Impact as follows: Impact should be defined by its relevance to the student body, innovation, and policy → subjective. </w:t>
+      </w:r>
+      <w:r>
+        <w:rPr>
+          <w:b w:val="1"/>
+          <w:bCs w:val="1"/>
+          <w:sz w:val="21"/>
+          <w:szCs w:val="21"/>
+          <w:rtl w:val="0"/>
+        </w:rPr>
+        <w:t xml:space="preserve">ANY </w:t>
+      </w:r>
+      <w:r>
+        <w:rPr>
+          <w:b w:val="1"/>
+          <w:bCs w:val="1"/>
+          <w:rtl w:val="0"/>
+        </w:rPr>
+        <w:t xml:space="preserve">AUTOMATED SCORE MAY BE OVERWRITTEN.</w:t>
+      </w:r>
+    </w:p>
+    <w:p>
+      <w:pPr>
+        <w:pStyle w:val="Heading2"/>
+        <w:spacing w:after="80" w:before="200" w:lineRule="auto"/>
+        <w:rPr/>
+      </w:pPr>
+      <w:r>
+        <w:rPr>
+          <w:b w:val="1"/>
+          <w:bCs w:val="1"/>
+          <w:color w:val="800000"/>
+          <w:rtl w:val="0"/>
+        </w:rPr>
+        <w:t xml:space="preserve">7.2 Objective scorer</w:t>
+      </w:r>
+      <w:r>
+        <w:rPr>
+          <w:rtl w:val="0"/>
+        </w:rPr>
+      </w:r>
+    </w:p>
+    <w:p>
+      <w:pPr>
+        <w:spacing w:after="120" w:lineRule="auto"/>
+        <w:jc w:val="both"/>
+        <w:rPr/>
+      </w:pPr>
+      <w:r>
+        <w:rPr>
+          <w:sz w:val="21"/>
+          <w:szCs w:val="21"/>
+          <w:rtl w:val="0"/>
+        </w:rPr>
+        <w:t xml:space="preserve">Alongside the human reviewers, an automatic scorer computes objective bin scores per club from application data and participates in the committee average with the standing of one reviewer:</w:t>
+      </w:r>
+      <w:r>
+        <w:rPr>
+          <w:rtl w:val="0"/>
+        </w:rPr>
+      </w:r>
+    </w:p>
+    <w:p>
+      <w:pPr>
+        <w:numPr>
+          <w:ilvl w:val="0"/>
+          <w:numId w:val="1"/>
+        </w:numPr>
+        <w:spacing w:after="0" w:afterAutospacing="0" w:lineRule="auto"/>
+        <w:ind w:left="720" w:hanging="360"/>
+        <w:jc w:val="both"/>
+        <w:rPr>
+          <w:sz w:val="21"/>
+          <w:szCs w:val="21"/>
+          <w:u w:val="none"/>
+        </w:rPr>
+      </w:pPr>
+      <w:r>
+        <w:rPr>
+          <w:b w:val="1"/>
+          <w:bCs w:val="1"/>
           <w:sz w:val="21"/>
           <w:szCs w:val="21"/>
           <w:rtl w:val="0"/>
@@ -1983,7 +2149,7 @@
           <w:szCs w:val="21"/>
           <w:rtl w:val="0"/>
         </w:rPr>
-        <w:t xml:space="preserve"> from rollover discipline (5 at zero rollover, declining linearly to 1 where rollover equals or exceeds the request; food discipline is enforced by the §4 exclusions and is deliberately not double-counted here):  5 − 4 × (rollover ÷ request)</w:t>
+        <w:t xml:space="preserve"> from rollover discipline (rollover net of any earmarked funds approved under §6.1; 5 at zero rollover, declining linearly to 1 where rollover equals or exceeds the request; food discipline is enforced by the §4 exclusions and is deliberately not double-counted here):  5 − 4 × (rollover ÷ request)</w:t>
       </w:r>
       <w:r>
         <w:rPr>

</xml_diff>

<commit_message>
Allow earmarks for itemized future events within the academic year
Co-Authored-By: Claude Opus 5.5 <noreply@anthropic.com>
</commit_message>
<xml_diff>
--- a/policy/Fall 2026 Allocation Policy and Methodology.docx
+++ b/policy/Fall 2026 Allocation Policy and Methodology.docx
@@ -1838,7 +1838,7 @@
           <w:szCs w:val="21"/>
           <w:rtl w:val="0"/>
         </w:rPr>
-        <w:t xml:space="preserve">The committee treats an HSO’s full HarrisHub “Available” balance as rollover that can go toward its events. An HSO can ask to have part of that balance set aside only if the money is restricted by someone outside the HSO:</w:t>
+        <w:t xml:space="preserve">The committee treats an HSO’s full HarrisHub “Available” balance as rollover that can go toward its events. An HSO can ask to have part of that balance set aside as an earmark in three cases:</w:t>
       </w:r>
     </w:p>
     <w:p>
@@ -1909,6 +1909,39 @@
     </w:p>
     <w:p>
       <w:pPr>
+        <w:numPr>
+          <w:ilvl w:val="0"/>
+          <w:numId w:val="1"/>
+        </w:numPr>
+        <w:spacing w:after="0" w:afterAutospacing="0" w:lineRule="auto"/>
+        <w:ind w:left="720" w:hanging="360"/>
+        <w:jc w:val="both"/>
+        <w:rPr>
+          <w:sz w:val="21"/>
+          <w:szCs w:val="21"/>
+          <w:u w:val="none"/>
+        </w:rPr>
+      </w:pPr>
+      <w:r>
+        <w:rPr>
+          <w:sz w:val="21"/>
+          <w:szCs w:val="21"/>
+          <w:rtl w:val="0"/>
+          <w:b/>
+        </w:rPr>
+        <w:t xml:space="preserve">Planned future event: </w:t>
+      </w:r>
+      <w:r>
+        <w:rPr>
+          <w:sz w:val="21"/>
+          <w:szCs w:val="21"/>
+          <w:rtl w:val="0"/>
+        </w:rPr>
+        <w:t xml:space="preserve">a specific event the HSO will hold later in the same academic year (through Spring Quarter), itemized in the application like a current event, with its estimated cost and planned quarter.</w:t>
+      </w:r>
+    </w:p>
+    <w:p>
+      <w:pPr>
         <w:spacing w:after="120" w:lineRule="auto" w:before="120"/>
         <w:jc w:val="both"/>
         <w:rPr/>
@@ -1936,7 +1969,7 @@
           <w:szCs w:val="21"/>
           <w:rtl w:val="0"/>
         </w:rPr>
-        <w:t xml:space="preserve"> (a sponsor email, agreement or invoice). Approved amounts are left out of rollover when Financial Stewardship is scored.</w:t>
+        <w:t xml:space="preserve"> (a sponsor email, agreement or invoice, or the itemized budget for a planned event). The amount set aside can’t exceed the documented or itemized cost. Approved amounts are left out of rollover when Financial Stewardship is scored.</w:t>
       </w:r>
     </w:p>
     <w:p>
@@ -1960,7 +1993,7 @@
           <w:szCs w:val="21"/>
           <w:rtl w:val="0"/>
         </w:rPr>
-        <w:t xml:space="preserve">money the HSO plans to save for its own purposes, such as an end-of-year event or a future quarter. Pending expenses already shown in HarrisHub don’t count either, because the “Available” balance already subtracts them.</w:t>
+        <w:t xml:space="preserve">general savings, unspecified “future events,” and spending planned after the academic year ends. Pending expenses already shown in HarrisHub don’t count either, because the “Available” balance already subtracts them.</w:t>
       </w:r>
     </w:p>
     <w:p>

</xml_diff>

<commit_message>
Send unallocated budget to the Emergency Reserve for HSOs, including new HSOs
Co-Authored-By: Claude Opus 5.5 <noreply@anthropic.com>
</commit_message>
<xml_diff>
--- a/policy/Fall 2026 Allocation Policy and Methodology.docx
+++ b/policy/Fall 2026 Allocation Policy and Methodology.docx
@@ -370,7 +370,7 @@
                 <w:szCs w:val="19"/>
                 <w:rtl w:val="0"/>
               </w:rPr>
-              <w:t>Set by committee for Fall 2026: the full $20,000 is distributed; no reserve</w:t>
+              <w:t>Set by committee for Fall 2026; any amount not allocated after committee adjustments goes to the Emergency Reserve</w:t>
             </w:r>
             <w:r>
               <w:rPr>
@@ -735,7 +735,7 @@
                 <w:szCs w:val="19"/>
                 <w:rtl w:val="0"/>
               </w:rPr>
-              <w:t xml:space="preserve">$2,000</w:t>
+              <w:t>$540</w:t>
             </w:r>
             <w:r>
               <w:rPr>
@@ -766,7 +766,7 @@
                 <w:szCs w:val="19"/>
                 <w:rtl w:val="0"/>
               </w:rPr>
-              <w:t>None this quarter. When funded, a dedicated line on top of the distributable pool for mid-quarter emergency and flagship requests (§8)</w:t>
+              <w:t>Fall 2026: the budget left unallocated after committee adjustments. Held for new HSOs and other HSO use (§8)</w:t>
             </w:r>
             <w:r>
               <w:rPr>
@@ -2624,7 +2624,7 @@
           <w:szCs w:val="21"/>
           <w:rtl w:val="0"/>
         </w:rPr>
-        <w:t>Columns from Flat through Total Allocated in the Results tab are formula-driven and are never overwritten by hand. Committee discretion is exercised in exactly one place: the Committee Nomination column, which is seeded with the formula result and may be overridden only with a written justification in the adjacent column. For Fall 2026 the committee set the reserve to $0, so the full $20,000 is distributed to HSOs. Rounding residue and enforcement recoveries (for example, unitemized request reductions not redistributed under §6 defaults) are still recorded. Any future reserve is funded as a dedicated budget line on top of the distributable pool, so it costs no club any allocation, and is drawn only by application and majority vote. Every draw and credit is recorded in the Reserve Log tab of the allocation workbook at decision time (date, club, amount, purpose, vote, justification, running balance), and the unspent balance is reported at quarter close and rolls into the next quarter budget.</w:t>
+        <w:t>Columns from Flat through Total Allocated in the Results tab are formula-driven and are never overwritten by hand. Committee discretion is exercised in exactly one place: the Committee Nomination column, which is seeded with the formula result and may be overridden only with a written justification in the adjacent column. Any part of the quarterly budget left unallocated after committee adjustments goes to the Emergency Reserve, which is set aside for HSO use, including new HSOs that form after the application deadline. For Fall 2026 that is $540. Rounding residue and enforcement recoveries (for example, unitemized request reductions not redistributed under §6 defaults) are still recorded. Any future reserve is funded as a dedicated budget line on top of the distributable pool, so it costs no club any allocation, and is drawn only by application and majority vote. Every draw and credit is recorded in the Reserve Log tab of the allocation workbook at decision time (date, club, amount, purpose, vote, justification, running balance), and the unspent balance is reported at quarter close and rolls into the next quarter budget.</w:t>
       </w:r>
       <w:r>
         <w:rPr>

</xml_diff>

<commit_message>
Update to Final (10): SASPA HSO Fair credit, ,500 allocated,  to reserve
Co-Authored-By: Claude Opus 5.5 <noreply@anthropic.com>
</commit_message>
<xml_diff>
--- a/policy/Fall 2026 Allocation Policy and Methodology.docx
+++ b/policy/Fall 2026 Allocation Policy and Methodology.docx
@@ -735,7 +735,7 @@
                 <w:szCs w:val="19"/>
                 <w:rtl w:val="0"/>
               </w:rPr>
-              <w:t>$540</w:t>
+              <w:t>$500</w:t>
             </w:r>
             <w:r>
               <w:rPr>
@@ -2624,7 +2624,7 @@
           <w:szCs w:val="21"/>
           <w:rtl w:val="0"/>
         </w:rPr>
-        <w:t>Columns from Flat through Total Allocated in the Results tab are formula-driven and are never overwritten by hand. Committee discretion is exercised in exactly one place: the Committee Nomination column, which is seeded with the formula result and may be overridden only with a written justification in the adjacent column. Any part of the quarterly budget left unallocated after committee adjustments goes to the Emergency Reserve, which is set aside for HSO use, including new HSOs that form after the application deadline. For Fall 2026 that is $540. Rounding residue and enforcement recoveries (for example, unitemized request reductions not redistributed under §6 defaults) are still recorded. Any future reserve is funded as a dedicated budget line on top of the distributable pool, so it costs no club any allocation, and is drawn only by application and majority vote. Every draw and credit is recorded in the Reserve Log tab of the allocation workbook at decision time (date, club, amount, purpose, vote, justification, running balance), and the unspent balance is reported at quarter close and rolls into the next quarter budget.</w:t>
+        <w:t>Columns from Flat through Total Allocated in the Results tab are formula-driven and are never overwritten by hand. Committee discretion is exercised in exactly one place: the Committee Nomination column, which is seeded with the formula result and may be overridden only with a written justification in the adjacent column. Any part of the quarterly budget left unallocated after committee adjustments goes to the Emergency Reserve, which is set aside for HSO use, including new HSOs that form after the application deadline. For Fall 2026 that is $500. Rounding residue and enforcement recoveries (for example, unitemized request reductions not redistributed under §6 defaults) are still recorded. Any future reserve is funded as a dedicated budget line on top of the distributable pool, so it costs no club any allocation, and is drawn only by application and majority vote. Every draw and credit is recorded in the Reserve Log tab of the allocation workbook at decision time (date, club, amount, purpose, vote, justification, running balance), and the unspent balance is reported at quarter close and rolls into the next quarter budget.</w:t>
       </w:r>
       <w:r>
         <w:rPr>

</xml_diff>